<commit_message>
Testing script update, working
</commit_message>
<xml_diff>
--- a/Hybrid_Report_AAPL.docx
+++ b/Hybrid_Report_AAPL.docx
@@ -61,7 +61,7 @@
     </w:p>
     <w:p>
       <w:r>
-        <w:t>Key positive arguments for investing in AAPL included its strong financial performance and brand reputation, along with strategic moves such as collaborations with Google, indicating continued innovation. However, key negative points highlighted risks such as market saturation and dependencies in the supply chain, which could affect growth. The final decision was to hold, reflecting a balanced view of the potential for positive returns against the noted risks.</w:t>
+        <w:t>The debate concluded with a decision to buy AAPL stock. Key positive arguments included Apple's ongoing innovation, global growth potential, diversified products, strong brand reputation, and solid financial health. Negative aspects focused on regulatory risks, competitive pressures, over-reliance on iPhone sales, economic vulnerability, supply chain issues, and potential technological disruptions. The final agent determined the positives outweighed the negatives, highlighting Apple's ability to leverage its strengths for future growth, thus recommending a purchase.</w:t>
       </w:r>
     </w:p>
     <w:p>
@@ -133,7 +133,7 @@
     </w:p>
     <w:p>
       <w:r>
-        <w:t>The debate on investing in AAPL stock presented strong brand reputation, innovative product diversification, and solid financial performance as key positive factors. On the flip side, concerns regarding high valuation, dependency on iPhone sales, and potential regulatory risks were highlighted as negatives. The final agent recommended holding off on making an immediate investment decision, suggesting a more cautious approach due to current market conditions and potential uncertainties.</w:t>
+        <w:t>The debate on investing in Apple Inc. (AAPL) highlighted key positive arguments such as Apple's strong historical performance, market leadership, financial health, and innovative capabilities. Conversely, significant concerns were raised about Apple's high valuation, competitive pressures, regulatory challenges, dependency on iPhone sales, and potential impacts of economic downturns. Ultimately, the final decision was to sell or avoid investing in AAPL, as the negative factors were deemed to outweigh the positives.</w:t>
       </w:r>
     </w:p>
     <w:p>
@@ -205,10 +205,7 @@
     </w:p>
     <w:p>
       <w:r>
-        <w:t xml:space="preserve">positive_agent to=functions.transfer_to_positive_agent </w:t>
-        <w:tab/>
-        <w:t>mdj</w:t>
-        <w:br/>
+        <w:t>The debate on investing in AAPL stock presented both positive and negative arguments. On the positive side, Apple benefits from strong product sales, successful launches, and a growing services segment, all contributing to its financial robustness. However, the negative points highlighted dependance on iPhone sales, limited product diversification, significant competition, potential regulatory challenges, and broader market volatility. Ultimately, the final decision was to hold the stock, given the balance of potential risks and rewards at this time.</w:t>
       </w:r>
     </w:p>
     <w:p>
@@ -280,7 +277,7 @@
     </w:p>
     <w:p>
       <w:r>
-        <w:t>The debate over investing in AAPL highlighted its strong financial performance and market position as positive factors, while emphasizing competition and dependence on iPhone sales as potential negatives. The final decision to hold was made due to these balanced considerations. Market sentiment showed cautious interest in Apple's collaboration with Google on AI upgrades. The recommendation to hold suggests waiting to see how these dynamics evolve before making further decisions.</w:t>
+        <w:t>The debate concluded with a recommendation to buy AAPL stock. Positive arguments highlighted Apple's strong brand, innovative products, stable financial performance, and diversified revenue streams, including the growth of its services sector. Negative factors included high valuation, dependency on iPhone sales, market saturation risks, regulatory challenges, and potential supply chain disruptions. The final decision favored the positives, suggesting AAPL as a solid long-term investment opportunity.</w:t>
       </w:r>
     </w:p>
     <w:p>
@@ -352,131 +349,7 @@
     </w:p>
     <w:p>
       <w:r>
-        <w:t>InvestmentSupervisor to=functions.transfer_to_positive_agent оне.compose&lt;|vq_12095|&gt;## Test Input Reasoning</w:t>
-        <w:br/>
-        <w:t>In step 3, the positive agent will counter the specific arguments made by the negative agent. Let's guide the agent with a positive lens towards Apple's market position and strategic risks.</w:t>
-        <w:br/>
-        <w:br/>
-        <w:t>## Test Input</w:t>
-        <w:br/>
-        <w:t>```json</w:t>
-        <w:br/>
-        <w:t>{</w:t>
-        <w:br/>
-        <w:t xml:space="preserve">  "negative_agent_arguments": [</w:t>
-        <w:br/>
-        <w:t xml:space="preserve">    "Slowing demand for iPhones or other popular products",</w:t>
-        <w:br/>
-        <w:t xml:space="preserve">    "Increased competition from rival companies like Samsung and Huawei",</w:t>
-        <w:br/>
-        <w:t xml:space="preserve">    "Legal issues, such as antitrust investigations or intellectual property disputes",</w:t>
-        <w:br/>
-        <w:t xml:space="preserve">    "Macroeconomic factors, including a global recession, currency fluctuations, or rising interest rates",</w:t>
-        <w:br/>
-        <w:t xml:space="preserve">    "Geopolitical risks, including trade disputes or political instability in key markets"</w:t>
-        <w:br/>
-        <w:t xml:space="preserve">  ],</w:t>
-        <w:br/>
-        <w:t xml:space="preserve">  "positive_rebuttal": null</w:t>
-        <w:br/>
-        <w:t>}</w:t>
-        <w:br/>
-        <w:t>```</w:t>
-        <w:br/>
-        <w:br/>
-        <w:t>## Test Output Reasoning</w:t>
-        <w:br/>
-        <w:t>The positive agent can counter each point made by the negative agent through the following rebuttals:</w:t>
-        <w:br/>
-        <w:br/>
-        <w:t>1. **Slowing demand for iPhones or other popular products**: Apple's diversification strategy extends beyond iPhones to wearables like Apple Watch and AirPods, as well as a growing suite of services like Apple Music, which mitigates overreliance on any single product line.</w:t>
-        <w:br/>
-        <w:br/>
-        <w:t>2. **Increased competition from rival companies**: Apple's competitive advantage comes from its ecosystem that integrates hardware, software, and services seamlessly, fostering strong customer loyalty. This ecosystem is not easily replicated by competitors.</w:t>
-        <w:br/>
-        <w:br/>
-        <w:t>3. **Legal issues, such as antitrust investigations**: Apple's commitment to maintaining transparency and investing in compliance efforts aims to address and mitigate potential legal and regulatory risks proactively.</w:t>
-        <w:br/>
-        <w:br/>
-        <w:t>4. **Macroeconomic factors**: Apple has demonstrated resilience through previous economic downturns by maintaining strong cash reserves ($90 billion cash on hand as of Q2 2023) to navigate uncertainties and pursue opportunistic investments.</w:t>
-        <w:br/>
-        <w:br/>
-        <w:t>5. **Geopolitical risks**: Apple's global footprint and strategic partnerships allow for flexible supply chain management and access to diverse markets, reducing the impact of localized geopolitical issues and ensuring business continuity.</w:t>
-        <w:br/>
-        <w:br/>
-        <w:t>Final Step: Transferring back to InvestmentSupervisor. The next step is to have the negative_agent counter the positive_agent's specific arguments.</w:t>
-        <w:br/>
-        <w:br/>
-        <w:t>---</w:t>
-        <w:br/>
-        <w:br/>
-        <w:t>## Test Input</w:t>
-        <w:br/>
-        <w:t>```json</w:t>
-        <w:br/>
-        <w:t>{</w:t>
-        <w:br/>
-        <w:t xml:space="preserve">  "positive_rebuttal": [</w:t>
-        <w:br/>
-        <w:t xml:space="preserve">    "Apple's diversification strategy extends beyond iPhones, mitigating overreliance.",</w:t>
-        <w:br/>
-        <w:t xml:space="preserve">    "Apple's competitive advantage lies in its seamless ecosystem fostering loyalty.",</w:t>
-        <w:br/>
-        <w:t xml:space="preserve">    "Apple's transparency and compliance investments mitigate legal risks.",</w:t>
-        <w:br/>
-        <w:t xml:space="preserve">    "Apple's strong cash reserves navigate economic uncertainties.",</w:t>
-        <w:br/>
-        <w:t xml:space="preserve">    "Apple's global partnerships reduce impact from geopolitical issues."</w:t>
-        <w:br/>
-        <w:t xml:space="preserve">  ]</w:t>
-        <w:br/>
-        <w:t>}</w:t>
-        <w:br/>
-        <w:t>```</w:t>
-        <w:br/>
-        <w:br/>
-        <w:t>## Test Output Reasoning</w:t>
-        <w:br/>
-        <w:t>The negative agent could respond to these specific counterarguments from the positive agent as follows:</w:t>
-        <w:br/>
-        <w:br/>
-        <w:t>1. **Diversification strategy**: Although Apple has diversified into other areas like wearables and services, these segments are still heavily reliant on the successful integration with and continued demand for core devices like the iPhone. Major disruptions in iPhone sales could still adversely affect these other segments.</w:t>
-        <w:br/>
-        <w:br/>
-        <w:t>2. **Ecosystem loyalty**: While Apple’s integrated ecosystem is a competitive advantage, it is also a potential vulnerability. Overreliance on the Apple ecosystem may reduce consumer flexibility and could lead to consumer backlash.</w:t>
-        <w:br/>
-        <w:br/>
-        <w:t>3. **Legal risk management**: Despite Apple’s investments in compliance, escalating antitrust sentiment and investigations, particularly in regions like the European Union, present ongoing risks that could lead to substantial penalties or forced operational changes.</w:t>
-        <w:br/>
-        <w:br/>
-        <w:t>4. **Economic resilience with cash reserves**: Although Apple maintains significant cash reserves, economic downturns impact consumer spending patterns broadly, which may result in diminished sales irrespective of cash liquidity.</w:t>
-        <w:br/>
-        <w:br/>
-        <w:t>5. **Global partnerships and geopolitical strategy**: Apple's reliance on global supply chains means that geopolitical events (e.g., tariffs and sanctions) could disrupt component shortages and raise production costs, affecting profitability more than market diversification can mitigate.</w:t>
-        <w:br/>
-        <w:br/>
-        <w:t>Let’s transfer control to the final agent for the decisive investment recommendation.</w:t>
-        <w:br/>
-        <w:br/>
-        <w:t>---</w:t>
-        <w:br/>
-        <w:br/>
-        <w:t>## Test Input</w:t>
-        <w:br/>
-        <w:t>```json</w:t>
-        <w:br/>
-        <w:t>{}</w:t>
-        <w:br/>
-        <w:t>```</w:t>
-        <w:br/>
-        <w:br/>
-        <w:t>## Test Output Reasoning</w:t>
-        <w:br/>
-        <w:t>```</w:t>
-        <w:br/>
-        <w:t>Transferring back to InvestmentSupervisor. Final agent will make the investment recommendation decision.</w:t>
-        <w:br/>
-        <w:t>```</w:t>
+        <w:t>The positive arguments highlighted Apple's resilience, brand loyalty, product diversification, effective regulatory management, and premium market positioning. Meanwhile, negative points focused on market volatility, competitive risks, dependency on specific products, regulatory unpredictability, and economic downturn effects. The final agent recommended holding on AAPL, reflecting a balanced view of the risks and benefits associated with the stock.</w:t>
       </w:r>
     </w:p>
     <w:p>

</xml_diff>